<commit_message>
Update plantilla memoria TFG 2020.docx
</commit_message>
<xml_diff>
--- a/docs/plantilla memoria TFG 2020.docx
+++ b/docs/plantilla memoria TFG 2020.docx
@@ -3776,7 +3776,7 @@
           <w:rFonts w:ascii="Latin Modern Roman 12" w:eastAsiaTheme="minorEastAsia" w:hAnsi="Latin Modern Roman 12"/>
           <w:b w:val="0"/>
           <w:noProof/>
-          <w:lang w:val="en-US" w:eastAsia="es-ES"/>
+          <w:lang w:val="es-ES" w:eastAsia="es-ES"/>
         </w:rPr>
       </w:pPr>
       <w:r>
@@ -3788,7 +3788,7 @@
       <w:r>
         <w:rPr>
           <w:rFonts w:ascii="Latin Modern Roman 12" w:hAnsi="Latin Modern Roman 12"/>
-          <w:lang w:val="en-US"/>
+          <w:lang w:val="es-ES"/>
         </w:rPr>
         <w:instrText xml:space="preserve"> TOC \o "1-3" </w:instrText>
       </w:r>
@@ -3802,7 +3802,7 @@
         <w:rPr>
           <w:rFonts w:ascii="Latin Modern Roman 12" w:hAnsi="Latin Modern Roman 12"/>
           <w:noProof/>
-          <w:lang w:val="en-US"/>
+          <w:lang w:val="es-ES"/>
         </w:rPr>
         <w:t>Resumen</w:t>
       </w:r>
@@ -3810,7 +3810,7 @@
         <w:rPr>
           <w:rFonts w:ascii="Latin Modern Roman 12" w:hAnsi="Latin Modern Roman 12"/>
           <w:noProof/>
-          <w:lang w:val="en-US"/>
+          <w:lang w:val="es-ES"/>
         </w:rPr>
         <w:tab/>
       </w:r>
@@ -3825,7 +3825,7 @@
         <w:rPr>
           <w:rFonts w:ascii="Latin Modern Roman 12" w:hAnsi="Latin Modern Roman 12"/>
           <w:noProof/>
-          <w:lang w:val="en-US"/>
+          <w:lang w:val="es-ES"/>
         </w:rPr>
         <w:instrText xml:space="preserve"> PAGEREF _Toc505373791 \h </w:instrText>
       </w:r>
@@ -3846,7 +3846,7 @@
         <w:rPr>
           <w:rFonts w:ascii="Latin Modern Roman 12" w:hAnsi="Latin Modern Roman 12"/>
           <w:noProof/>
-          <w:lang w:val="en-US"/>
+          <w:lang w:val="es-ES"/>
         </w:rPr>
         <w:t>1</w:t>
       </w:r>
@@ -3868,14 +3868,14 @@
           <w:rFonts w:ascii="Latin Modern Roman 12" w:eastAsiaTheme="minorEastAsia" w:hAnsi="Latin Modern Roman 12"/>
           <w:b w:val="0"/>
           <w:noProof/>
-          <w:lang w:val="en-US" w:eastAsia="es-ES"/>
+          <w:lang w:val="es-ES" w:eastAsia="es-ES"/>
         </w:rPr>
       </w:pPr>
       <w:r>
         <w:rPr>
           <w:rFonts w:ascii="Latin Modern Roman 12" w:hAnsi="Latin Modern Roman 12"/>
           <w:noProof/>
-          <w:lang w:val="en-US"/>
+          <w:lang w:val="es-ES"/>
         </w:rPr>
         <w:t>Abstract</w:t>
       </w:r>
@@ -3883,7 +3883,7 @@
         <w:rPr>
           <w:rFonts w:ascii="Latin Modern Roman 12" w:hAnsi="Latin Modern Roman 12"/>
           <w:noProof/>
-          <w:lang w:val="en-US"/>
+          <w:lang w:val="es-ES"/>
         </w:rPr>
         <w:tab/>
       </w:r>
@@ -3898,7 +3898,7 @@
         <w:rPr>
           <w:rFonts w:ascii="Latin Modern Roman 12" w:hAnsi="Latin Modern Roman 12"/>
           <w:noProof/>
-          <w:lang w:val="en-US"/>
+          <w:lang w:val="es-ES"/>
         </w:rPr>
         <w:instrText xml:space="preserve"> PAGEREF _Toc505373792 \h </w:instrText>
       </w:r>
@@ -3919,7 +3919,7 @@
         <w:rPr>
           <w:rFonts w:ascii="Latin Modern Roman 12" w:hAnsi="Latin Modern Roman 12"/>
           <w:noProof/>
-          <w:lang w:val="en-US"/>
+          <w:lang w:val="es-ES"/>
         </w:rPr>
         <w:t>1</w:t>
       </w:r>
@@ -3941,14 +3941,14 @@
           <w:rFonts w:ascii="Latin Modern Roman 12" w:eastAsiaTheme="minorEastAsia" w:hAnsi="Latin Modern Roman 12"/>
           <w:b w:val="0"/>
           <w:noProof/>
-          <w:lang w:val="en-US" w:eastAsia="es-ES"/>
+          <w:lang w:val="es-ES" w:eastAsia="es-ES"/>
         </w:rPr>
       </w:pPr>
       <w:r>
         <w:rPr>
           <w:rFonts w:ascii="Latin Modern Roman 12" w:hAnsi="Latin Modern Roman 12"/>
           <w:noProof/>
-          <w:lang w:val="en-US"/>
+          <w:lang w:val="es-ES"/>
         </w:rPr>
         <w:t>Índice</w:t>
       </w:r>
@@ -3956,7 +3956,7 @@
         <w:rPr>
           <w:rFonts w:ascii="Latin Modern Roman 12" w:hAnsi="Latin Modern Roman 12"/>
           <w:noProof/>
-          <w:lang w:val="en-US"/>
+          <w:lang w:val="es-ES"/>
         </w:rPr>
         <w:tab/>
       </w:r>
@@ -3971,7 +3971,7 @@
         <w:rPr>
           <w:rFonts w:ascii="Latin Modern Roman 12" w:hAnsi="Latin Modern Roman 12"/>
           <w:noProof/>
-          <w:lang w:val="en-US"/>
+          <w:lang w:val="es-ES"/>
         </w:rPr>
         <w:instrText xml:space="preserve"> PAGEREF _Toc505373793 \h </w:instrText>
       </w:r>
@@ -3992,7 +3992,7 @@
         <w:rPr>
           <w:rFonts w:ascii="Latin Modern Roman 12" w:hAnsi="Latin Modern Roman 12"/>
           <w:noProof/>
-          <w:lang w:val="en-US"/>
+          <w:lang w:val="es-ES"/>
         </w:rPr>
         <w:t>1</w:t>
       </w:r>
@@ -4014,14 +4014,14 @@
           <w:rFonts w:ascii="Latin Modern Roman 12" w:eastAsiaTheme="minorEastAsia" w:hAnsi="Latin Modern Roman 12"/>
           <w:b w:val="0"/>
           <w:noProof/>
-          <w:lang w:val="en-US" w:eastAsia="es-ES"/>
+          <w:lang w:val="es-ES" w:eastAsia="es-ES"/>
         </w:rPr>
       </w:pPr>
       <w:r>
         <w:rPr>
           <w:rFonts w:ascii="Latin Modern Roman 12" w:hAnsi="Latin Modern Roman 12"/>
           <w:noProof/>
-          <w:lang w:val="en-US"/>
+          <w:lang w:val="es-ES"/>
         </w:rPr>
         <w:t>Introducción</w:t>
       </w:r>
@@ -4029,7 +4029,7 @@
         <w:rPr>
           <w:rFonts w:ascii="Latin Modern Roman 12" w:hAnsi="Latin Modern Roman 12"/>
           <w:noProof/>
-          <w:lang w:val="en-US"/>
+          <w:lang w:val="es-ES"/>
         </w:rPr>
         <w:tab/>
       </w:r>
@@ -4044,7 +4044,7 @@
         <w:rPr>
           <w:rFonts w:ascii="Latin Modern Roman 12" w:hAnsi="Latin Modern Roman 12"/>
           <w:noProof/>
-          <w:lang w:val="en-US"/>
+          <w:lang w:val="es-ES"/>
         </w:rPr>
         <w:instrText xml:space="preserve"> PAGEREF _Toc505373794 \h </w:instrText>
       </w:r>
@@ -4065,7 +4065,7 @@
         <w:rPr>
           <w:rFonts w:ascii="Latin Modern Roman 12" w:hAnsi="Latin Modern Roman 12"/>
           <w:noProof/>
-          <w:lang w:val="en-US"/>
+          <w:lang w:val="es-ES"/>
         </w:rPr>
         <w:t>1</w:t>
       </w:r>
@@ -4209,7 +4209,7 @@
           <w:rFonts w:ascii="Latin Modern Roman 12" w:hAnsi="Latin Modern Roman 12"/>
           <w:noProof/>
         </w:rPr>
-        <w:t>1</w:t>
+        <w:t>2</w:t>
       </w:r>
       <w:r>
         <w:rPr>
@@ -4280,7 +4280,7 @@
           <w:rFonts w:ascii="Latin Modern Roman 12" w:hAnsi="Latin Modern Roman 12"/>
           <w:noProof/>
         </w:rPr>
-        <w:t>3</w:t>
+        <w:t>4</w:t>
       </w:r>
       <w:r>
         <w:rPr>
@@ -4349,7 +4349,7 @@
           <w:rFonts w:ascii="Latin Modern Roman 12" w:hAnsi="Latin Modern Roman 12"/>
           <w:noProof/>
         </w:rPr>
-        <w:t>9</w:t>
+        <w:t>13</w:t>
       </w:r>
       <w:r>
         <w:rPr>
@@ -4418,7 +4418,7 @@
           <w:rFonts w:ascii="Latin Modern Roman 12" w:hAnsi="Latin Modern Roman 12"/>
           <w:noProof/>
         </w:rPr>
-        <w:t>11</w:t>
+        <w:t>15</w:t>
       </w:r>
       <w:r>
         <w:rPr>
@@ -4489,7 +4489,7 @@
           <w:rFonts w:ascii="Latin Modern Roman 12" w:hAnsi="Latin Modern Roman 12"/>
           <w:noProof/>
         </w:rPr>
-        <w:t>11</w:t>
+        <w:t>15</w:t>
       </w:r>
       <w:r>
         <w:rPr>
@@ -4555,6 +4555,7 @@
     </w:p>
     <w:p>
       <w:pPr>
+        <w:spacing w:line="360" w:lineRule="auto"/>
         <w:rPr>
           <w:lang w:val="es-ES"/>
         </w:rPr>
@@ -4563,13 +4564,7 @@
         <w:tab/>
       </w:r>
       <w:r>
-        <w:t xml:space="preserve">La popularidad de la NBA, la liga profesional de baloncesto de Estados Unidos y </w:t>
-      </w:r>
-      <w:r>
-        <w:t>Canadá</w:t>
-      </w:r>
-      <w:r>
-        <w:t xml:space="preserve"> genera a nivel global una alta demanda de herramientas destinadas al análisis de partidos y a la predicción eficiente de resultados. Aunque existen aplicaciones y sitios web que ofrecen estadísticas de la NBA, son pocos los que integran modelos de predicción basados en datos estadísticos detallados o en sucesos proporcionados en tiempo real o simulados.</w:t>
+        <w:t>La popularidad de la NBA, la liga profesional de baloncesto de Estados Unidos y Canadá genera a nivel global una alta demanda de herramientas destinadas al análisis de partidos y a la predicción eficiente de resultados. Aunque existen aplicaciones y sitios web que ofrecen estadísticas de la NBA, son pocos los que integran modelos de predicción basados en datos estadísticos detallados o en sucesos proporcionados en tiempo real o simulados.</w:t>
       </w:r>
     </w:p>
     <w:p>
@@ -4738,19 +4733,34 @@
       </w:r>
     </w:p>
     <w:p>
+      <w:pPr>
+        <w:spacing w:line="360" w:lineRule="auto"/>
+      </w:pPr>
       <w:r>
         <w:t>El principal objetivo de este Trabajo de Fin de Grado es el desarrollo de una aplicación web interactiva que permita consultar estadísticas detalladas de la NBA y generar predicciones probabilísticas sobre los resultados de los partidos. A diferencia de otras plataformas existentes, esta herramienta no solo proporcionará datos actualizados, sino que también permitirá a los usuarios ajustar parámetros personalizados, como introducir lesiones ficticias, con el fin de obtener simulaciones adaptadas a distintos escenarios hipotéticos o reales.</w:t>
       </w:r>
     </w:p>
-    <w:p/>
     <w:p>
+      <w:pPr>
+        <w:spacing w:line="360" w:lineRule="auto"/>
+      </w:pPr>
+    </w:p>
+    <w:p>
+      <w:pPr>
+        <w:spacing w:line="360" w:lineRule="auto"/>
+      </w:pPr>
       <w:r>
         <w:t>La solución planteada integrará una base de datos robusta con información histórica de equipos y jugadores, una interfaz de usuario moderna y un modelo de predicción estadístico basado en técnicas de probabilidad. Todo esto permitirá no solo el análisis objetivo de los datos, sino también la creación de escenarios dinámicos útiles tanto para el análisis deportivo como para aplicaciones educativas o recreativas.</w:t>
       </w:r>
     </w:p>
-    <w:p/>
     <w:p>
       <w:pPr>
+        <w:spacing w:line="360" w:lineRule="auto"/>
+      </w:pPr>
+    </w:p>
+    <w:p>
+      <w:pPr>
+        <w:spacing w:line="360" w:lineRule="auto"/>
         <w:rPr>
           <w:b/>
           <w:bCs/>
@@ -4771,6 +4781,7 @@
           <w:ilvl w:val="0"/>
           <w:numId w:val="130"/>
         </w:numPr>
+        <w:spacing w:line="360" w:lineRule="auto"/>
       </w:pPr>
       <w:r>
         <w:t>Diseño de una interfaz web intuitiva, rápida y responsiva que permita navegar y consultar los datos de manera eficiente desde distintos dispositivos.</w:t>
@@ -4783,6 +4794,7 @@
           <w:ilvl w:val="0"/>
           <w:numId w:val="130"/>
         </w:numPr>
+        <w:spacing w:line="360" w:lineRule="auto"/>
       </w:pPr>
       <w:r>
         <w:t>Predicción de resultados de partidos mediante un modelo probabilístico, utilizando como base las estadísticas históricas almacenadas en la base de datos y las condiciones de entrada proporcionadas.</w:t>
@@ -4795,14 +4807,20 @@
           <w:ilvl w:val="0"/>
           <w:numId w:val="130"/>
         </w:numPr>
+        <w:spacing w:line="360" w:lineRule="auto"/>
       </w:pPr>
       <w:r>
         <w:t>Consulta avanzada de estadísticas, que permita filtrar información por equipo, jugador y temporada, con visualización clara y categorizada de los datos.</w:t>
       </w:r>
     </w:p>
-    <w:p/>
     <w:p>
       <w:pPr>
+        <w:spacing w:line="360" w:lineRule="auto"/>
+      </w:pPr>
+    </w:p>
+    <w:p>
+      <w:pPr>
+        <w:spacing w:line="360" w:lineRule="auto"/>
         <w:rPr>
           <w:b/>
           <w:bCs/>
@@ -4825,6 +4843,7 @@
           <w:ilvl w:val="0"/>
           <w:numId w:val="131"/>
         </w:numPr>
+        <w:spacing w:line="360" w:lineRule="auto"/>
         <w:rPr>
           <w:lang w:val="es-ES"/>
         </w:rPr>
@@ -4843,6 +4862,7 @@
           <w:ilvl w:val="1"/>
           <w:numId w:val="131"/>
         </w:numPr>
+        <w:spacing w:line="360" w:lineRule="auto"/>
         <w:rPr>
           <w:lang w:val="es-ES"/>
         </w:rPr>
@@ -4861,6 +4881,7 @@
           <w:ilvl w:val="1"/>
           <w:numId w:val="131"/>
         </w:numPr>
+        <w:spacing w:line="360" w:lineRule="auto"/>
         <w:rPr>
           <w:lang w:val="es-ES"/>
         </w:rPr>
@@ -4869,6 +4890,7 @@
         <w:rPr>
           <w:lang w:val="es-ES"/>
         </w:rPr>
+        <w:lastRenderedPageBreak/>
         <w:t>Generación de predicciones: Posibilidad de generar predicciones de enfrentamientos entre equipos en función de estadísticas actuales o personalizadas (por ejemplo, simulando la baja de un jugador).</w:t>
       </w:r>
     </w:p>
@@ -4879,6 +4901,7 @@
           <w:ilvl w:val="1"/>
           <w:numId w:val="131"/>
         </w:numPr>
+        <w:spacing w:line="360" w:lineRule="auto"/>
         <w:rPr>
           <w:lang w:val="es-ES"/>
         </w:rPr>
@@ -4898,6 +4921,7 @@
     </w:p>
     <w:p>
       <w:pPr>
+        <w:spacing w:line="360" w:lineRule="auto"/>
         <w:rPr>
           <w:lang w:val="es-ES"/>
         </w:rPr>
@@ -4910,6 +4934,7 @@
           <w:ilvl w:val="0"/>
           <w:numId w:val="131"/>
         </w:numPr>
+        <w:spacing w:line="360" w:lineRule="auto"/>
         <w:rPr>
           <w:lang w:val="es-ES"/>
         </w:rPr>
@@ -4928,6 +4953,7 @@
           <w:ilvl w:val="1"/>
           <w:numId w:val="131"/>
         </w:numPr>
+        <w:spacing w:line="360" w:lineRule="auto"/>
         <w:rPr>
           <w:lang w:val="es-ES"/>
         </w:rPr>
@@ -4967,19 +4993,6 @@
           <w:lang w:val="es-ES"/>
         </w:rPr>
         <w:t>es posible confirmar estas situaciones como lesiones y registrar información complementaria, como el tipo de lesión y la duración estimada de recuperación.</w:t>
-      </w:r>
-    </w:p>
-    <w:p>
-      <w:pPr>
-        <w:rPr>
-          <w:lang w:val="es-ES"/>
-        </w:rPr>
-      </w:pPr>
-      <w:r>
-        <w:rPr>
-          <w:lang w:val="es-ES"/>
-        </w:rPr>
-        <w:br w:type="page"/>
       </w:r>
     </w:p>
     <w:p>
@@ -4989,6 +5002,7 @@
           <w:ilvl w:val="1"/>
           <w:numId w:val="131"/>
         </w:numPr>
+        <w:spacing w:line="360" w:lineRule="auto"/>
         <w:rPr>
           <w:lang w:val="es-ES"/>
         </w:rPr>
@@ -4997,7 +5011,6 @@
         <w:rPr>
           <w:lang w:val="es-ES"/>
         </w:rPr>
-        <w:lastRenderedPageBreak/>
         <w:t xml:space="preserve">Mantenimiento de la base de datos: </w:t>
       </w:r>
       <w:r>
@@ -5009,6 +5022,7 @@
     </w:p>
     <w:p>
       <w:pPr>
+        <w:spacing w:line="360" w:lineRule="auto"/>
         <w:rPr>
           <w:lang w:val="es-ES"/>
         </w:rPr>
@@ -5016,6 +5030,7 @@
     </w:p>
     <w:p>
       <w:pPr>
+        <w:spacing w:line="360" w:lineRule="auto"/>
         <w:rPr>
           <w:lang w:val="es-ES"/>
         </w:rPr>
@@ -5050,6 +5065,7 @@
     </w:p>
     <w:p>
       <w:pPr>
+        <w:spacing w:line="360" w:lineRule="auto"/>
         <w:rPr>
           <w:lang w:val="es-ES"/>
         </w:rPr>
@@ -5058,30 +5074,26 @@
         <w:rPr>
           <w:lang w:val="es-ES"/>
         </w:rPr>
-        <w:t>En</w:t>
-      </w:r>
-      <w:r>
-        <w:rPr>
-          <w:lang w:val="es-ES"/>
-        </w:rPr>
-        <w:t xml:space="preserve"> cuanto al análisis de estadísticas deportivas del baloncesto profesional de la NBA, ya existen varias plataformas que ofrecen servicios de consulta</w:t>
-      </w:r>
-      <w:r>
-        <w:rPr>
-          <w:lang w:val="es-ES"/>
-        </w:rPr>
-        <w:t xml:space="preserve"> el ámbito del análisis de estadísticas deportivas, y en concreto del baloncesto profesional de la NBA, existen varias plataformas que ofrecen servicios de consulta y predicción de resultados.</w:t>
+        <w:t>En el ámbito del análisis de estadísticas deportivas del baloncesto profesional de la NBA, existen diversas plataformas que ofrecen servicios de consulta y predicción de resultados.</w:t>
       </w:r>
     </w:p>
     <w:p>
       <w:pPr>
+        <w:jc w:val="left"/>
         <w:rPr>
           <w:lang w:val="es-ES"/>
         </w:rPr>
       </w:pPr>
+      <w:r>
+        <w:rPr>
+          <w:lang w:val="es-ES"/>
+        </w:rPr>
+        <w:br w:type="page"/>
+      </w:r>
     </w:p>
     <w:p>
       <w:pPr>
+        <w:spacing w:line="360" w:lineRule="auto"/>
         <w:rPr>
           <w:lang w:val="es-ES"/>
         </w:rPr>
@@ -5090,15 +5102,9 @@
         <w:rPr>
           <w:lang w:val="es-ES"/>
         </w:rPr>
+        <w:lastRenderedPageBreak/>
         <w:t>Entre las más destacadas se encuentran:</w:t>
       </w:r>
-    </w:p>
-    <w:p>
-      <w:pPr>
-        <w:rPr>
-          <w:lang w:val="es-ES"/>
-        </w:rPr>
-      </w:pPr>
     </w:p>
     <w:p>
       <w:pPr>
@@ -5107,12 +5113,15 @@
           <w:ilvl w:val="0"/>
           <w:numId w:val="132"/>
         </w:numPr>
+        <w:spacing w:line="360" w:lineRule="auto"/>
         <w:rPr>
           <w:lang w:val="es-ES"/>
         </w:rPr>
       </w:pPr>
       <w:r>
         <w:rPr>
+          <w:b/>
+          <w:bCs/>
           <w:i/>
           <w:iCs/>
           <w:lang w:val="es-ES"/>
@@ -5122,6 +5131,8 @@
       <w:proofErr w:type="spellStart"/>
       <w:r>
         <w:rPr>
+          <w:b/>
+          <w:bCs/>
           <w:i/>
           <w:iCs/>
           <w:lang w:val="es-ES"/>
@@ -5131,25 +5142,27 @@
       <w:proofErr w:type="spellEnd"/>
       <w:r>
         <w:rPr>
-          <w:i/>
-          <w:iCs/>
           <w:lang w:val="es-ES"/>
         </w:rPr>
-        <w:t xml:space="preserve"> (stats.nba.com)</w:t>
-      </w:r>
-      <w:r>
-        <w:rPr>
-          <w:lang w:val="es-ES"/>
-        </w:rPr>
-        <w:t>: Es el sitio oficial de la NBA para estadísticas. Proporciona una enorme cantidad de datos tanto históricos como en tiempo real sobre jugadores, equipos y partidos. Sin embargo, su enfoque principal es la visualización y consulta de datos, sin ofrecer modelos de predicción personalizables.</w:t>
+        <w:t>: Sitio oficial de la NBA dedicado a la publicación de estadísticas. Ofrece una amplia cantidad de datos tanto históricos como en tiempo real sobre jugadores, equipos y partidos. No obstante, su enfoque principal se centra en la visualización y consulta de datos, sin incorporar modelos de predicción personalizables.</w:t>
       </w:r>
     </w:p>
     <w:p>
       <w:pPr>
+        <w:spacing w:line="360" w:lineRule="auto"/>
         <w:rPr>
           <w:lang w:val="es-ES"/>
         </w:rPr>
       </w:pPr>
+      <w:hyperlink r:id="rId16" w:history="1">
+        <w:r>
+          <w:rPr>
+            <w:rStyle w:val="Hipervnculo"/>
+            <w:lang w:val="es-ES"/>
+          </w:rPr>
+          <w:t>https://www.nba.com/stats</w:t>
+        </w:r>
+      </w:hyperlink>
     </w:p>
     <w:p>
       <w:pPr>
@@ -5158,6 +5171,7 @@
           <w:ilvl w:val="0"/>
           <w:numId w:val="132"/>
         </w:numPr>
+        <w:spacing w:line="360" w:lineRule="auto"/>
         <w:rPr>
           <w:lang w:val="es-ES"/>
         </w:rPr>
@@ -5165,6 +5179,8 @@
       <w:proofErr w:type="spellStart"/>
       <w:r>
         <w:rPr>
+          <w:b/>
+          <w:bCs/>
           <w:i/>
           <w:iCs/>
           <w:lang w:val="es-ES"/>
@@ -5174,25 +5190,39 @@
       <w:proofErr w:type="spellEnd"/>
       <w:r>
         <w:rPr>
+          <w:b/>
+          <w:bCs/>
           <w:i/>
           <w:iCs/>
           <w:lang w:val="es-ES"/>
         </w:rPr>
-        <w:t xml:space="preserve"> Reference (basketball-reference.com)</w:t>
-      </w:r>
-      <w:r>
-        <w:rPr>
+        <w:t xml:space="preserve"> Reference</w:t>
+      </w:r>
+      <w:r>
+        <w:rPr>
+          <w:i/>
+          <w:iCs/>
           <w:lang w:val="es-ES"/>
         </w:rPr>
-        <w:t>: Una de las bases de datos más completas para estadísticas de baloncesto. Incluye estadísticas históricas de jugadores, equipos y temporadas completas. Aunque es una herramienta poderosa para analistas, carece de funcionalidades predictivas automáticas para los usuarios.</w:t>
+        <w:t>: Una de las bases de datos más completas en el ámbito de las estadísticas de baloncesto. Incluye información histórica de jugadores, equipos y temporadas completas. Aunque constituye una herramienta poderosa para el análisis, carece de funcionalidades predictivas automáticas.</w:t>
       </w:r>
     </w:p>
     <w:p>
       <w:pPr>
+        <w:spacing w:line="360" w:lineRule="auto"/>
         <w:rPr>
           <w:lang w:val="es-ES"/>
         </w:rPr>
       </w:pPr>
+      <w:hyperlink r:id="rId17" w:history="1">
+        <w:r>
+          <w:rPr>
+            <w:rStyle w:val="Hipervnculo"/>
+            <w:lang w:val="es-ES"/>
+          </w:rPr>
+          <w:t>https://www.basketball-reference.com/</w:t>
+        </w:r>
+      </w:hyperlink>
     </w:p>
     <w:p>
       <w:pPr>
@@ -5201,52 +5231,56 @@
           <w:ilvl w:val="0"/>
           <w:numId w:val="132"/>
         </w:numPr>
+        <w:spacing w:line="360" w:lineRule="auto"/>
         <w:rPr>
           <w:lang w:val="es-ES"/>
         </w:rPr>
       </w:pPr>
       <w:r>
         <w:rPr>
+          <w:b/>
+          <w:bCs/>
           <w:i/>
           <w:iCs/>
           <w:lang w:val="es-ES"/>
         </w:rPr>
-        <w:t>ESPN (espn.com/</w:t>
-      </w:r>
-      <w:proofErr w:type="spellStart"/>
+        <w:t>ESPN</w:t>
+      </w:r>
       <w:r>
         <w:rPr>
           <w:i/>
           <w:iCs/>
           <w:lang w:val="es-ES"/>
         </w:rPr>
-        <w:t>nba</w:t>
-      </w:r>
-      <w:proofErr w:type="spellEnd"/>
-      <w:r>
-        <w:rPr>
-          <w:i/>
-          <w:iCs/>
-          <w:lang w:val="es-ES"/>
-        </w:rPr>
-        <w:t>/)</w:t>
-      </w:r>
-      <w:r>
-        <w:rPr>
-          <w:lang w:val="es-ES"/>
-        </w:rPr>
-        <w:t>: Ofrece una combinación de estadísticas y análisis de expertos. En ocasiones, proporciona predicciones de partidos basadas en opiniones de especialistas o en modelos cerrados, pero no permite al usuario realizar simulaciones personalizadas basadas en parámetros estadísticos modificables.</w:t>
+        <w:t>: Plataforma que combina estadísticas y análisis de expertos. En determinadas ocasiones, ofrece predicciones de partidos basadas en opiniones de especialistas o en modelos cerrados, aunque no permite la realización de simulaciones personalizadas basadas en parámetros estadísticos modificables.</w:t>
       </w:r>
     </w:p>
     <w:p>
       <w:pPr>
+        <w:spacing w:line="360" w:lineRule="auto"/>
         <w:rPr>
           <w:lang w:val="es-ES"/>
         </w:rPr>
       </w:pPr>
+      <w:hyperlink r:id="rId18" w:history="1">
+        <w:r>
+          <w:rPr>
+            <w:rStyle w:val="Hipervnculo"/>
+            <w:lang w:val="es-ES"/>
+          </w:rPr>
+          <w:t>https://www.espn.com/nba/</w:t>
+        </w:r>
+      </w:hyperlink>
     </w:p>
     <w:p>
       <w:pPr>
+        <w:rPr>
+          <w:lang w:val="es-ES"/>
+        </w:rPr>
+      </w:pPr>
+    </w:p>
+    <w:p>
+      <w:pPr>
         <w:pStyle w:val="Subcapitulo"/>
       </w:pPr>
       <w:bookmarkStart w:id="9" w:name="_Toc434863403"/>
@@ -5274,6 +5308,7 @@
     </w:p>
     <w:p>
       <w:pPr>
+        <w:spacing w:line="360" w:lineRule="auto"/>
         <w:rPr>
           <w:lang w:val="es-ES"/>
         </w:rPr>
@@ -5282,11 +5317,12 @@
         <w:rPr>
           <w:lang w:val="es-ES"/>
         </w:rPr>
-        <w:t>Este documento se encuentra estructurado en varios capítulos, cada uno orientado a cubrir un aspecto concreto del desarrollo del Trabajo de Fin de Grado:</w:t>
+        <w:t>Este documento se estructura en varios capítulos, cada uno de ellos orientado a cubrir un aspecto específico del desarrollo del Trabajo de Fin de Grado:</w:t>
       </w:r>
     </w:p>
     <w:p>
       <w:pPr>
+        <w:spacing w:line="360" w:lineRule="auto"/>
         <w:rPr>
           <w:lang w:val="es-ES"/>
         </w:rPr>
@@ -5294,6 +5330,7 @@
     </w:p>
     <w:p>
       <w:pPr>
+        <w:spacing w:line="360" w:lineRule="auto"/>
         <w:rPr>
           <w:b/>
           <w:bCs/>
@@ -5311,6 +5348,7 @@
     </w:p>
     <w:p>
       <w:pPr>
+        <w:spacing w:line="360" w:lineRule="auto"/>
         <w:rPr>
           <w:lang w:val="es-ES"/>
         </w:rPr>
@@ -5319,11 +5357,12 @@
         <w:rPr>
           <w:lang w:val="es-ES"/>
         </w:rPr>
-        <w:t>Presenta la motivación del proyecto, los objetivos a alcanzar, el contexto del problema, herramientas similares ya existentes y una visión general de la estructura del documento.</w:t>
+        <w:t>Se presenta la motivación del proyecto, los objetivos a alcanzar, el contexto del problema, las herramientas similares existentes y una visión general de la estructura del documento.</w:t>
       </w:r>
     </w:p>
     <w:p>
       <w:pPr>
+        <w:spacing w:line="360" w:lineRule="auto"/>
         <w:rPr>
           <w:lang w:val="es-ES"/>
         </w:rPr>
@@ -5331,344 +5370,361 @@
     </w:p>
     <w:p>
       <w:pPr>
+        <w:spacing w:line="360" w:lineRule="auto"/>
+        <w:jc w:val="left"/>
         <w:rPr>
           <w:lang w:val="es-ES"/>
         </w:rPr>
       </w:pPr>
-    </w:p>
-    <w:p>
-      <w:pPr>
+      <w:r>
         <w:rPr>
           <w:b/>
           <w:bCs/>
           <w:lang w:val="es-ES"/>
         </w:rPr>
-      </w:pPr>
-      <w:r>
+        <w:t>Capítulo 2. Tecnologías y herramientas utilizadas</w:t>
+      </w:r>
+    </w:p>
+    <w:p>
+      <w:pPr>
+        <w:spacing w:line="360" w:lineRule="auto"/>
+        <w:rPr>
+          <w:lang w:val="es-ES"/>
+        </w:rPr>
+      </w:pPr>
+      <w:r>
+        <w:rPr>
+          <w:lang w:val="es-ES"/>
+        </w:rPr>
+        <w:t xml:space="preserve">Se describen las tecnologías, lenguajes de programación, </w:t>
+      </w:r>
+      <w:proofErr w:type="spellStart"/>
+      <w:r>
+        <w:rPr>
+          <w:lang w:val="es-ES"/>
+        </w:rPr>
+        <w:t>frameworks</w:t>
+      </w:r>
+      <w:proofErr w:type="spellEnd"/>
+      <w:r>
+        <w:rPr>
+          <w:lang w:val="es-ES"/>
+        </w:rPr>
+        <w:t xml:space="preserve"> y herramientas empleadas tanto en el desarrollo del </w:t>
+      </w:r>
+      <w:proofErr w:type="spellStart"/>
+      <w:r>
+        <w:rPr>
+          <w:lang w:val="es-ES"/>
+        </w:rPr>
+        <w:t>backend</w:t>
+      </w:r>
+      <w:proofErr w:type="spellEnd"/>
+      <w:r>
+        <w:rPr>
+          <w:lang w:val="es-ES"/>
+        </w:rPr>
+        <w:t xml:space="preserve"> como del </w:t>
+      </w:r>
+      <w:proofErr w:type="spellStart"/>
+      <w:r>
+        <w:rPr>
+          <w:lang w:val="es-ES"/>
+        </w:rPr>
+        <w:t>frontend</w:t>
+      </w:r>
+      <w:proofErr w:type="spellEnd"/>
+      <w:r>
+        <w:rPr>
+          <w:lang w:val="es-ES"/>
+        </w:rPr>
+        <w:t xml:space="preserve"> de la aplicación. Asimismo, se detallan los entornos y recursos hardware y software requeridos.</w:t>
+      </w:r>
+    </w:p>
+    <w:p>
+      <w:pPr>
+        <w:spacing w:line="360" w:lineRule="auto"/>
+        <w:rPr>
+          <w:lang w:val="es-ES"/>
+        </w:rPr>
+      </w:pPr>
+    </w:p>
+    <w:p>
+      <w:pPr>
+        <w:spacing w:line="360" w:lineRule="auto"/>
         <w:rPr>
           <w:b/>
           <w:bCs/>
           <w:lang w:val="es-ES"/>
         </w:rPr>
-        <w:t>Capítulo 2. Tecnologías y herramientas utilizadas</w:t>
-      </w:r>
-    </w:p>
-    <w:p>
-      <w:pPr>
-        <w:rPr>
-          <w:lang w:val="es-ES"/>
-        </w:rPr>
-      </w:pPr>
-      <w:r>
-        <w:rPr>
-          <w:lang w:val="es-ES"/>
-        </w:rPr>
-        <w:t xml:space="preserve">Describe las tecnologías, lenguajes de programación, </w:t>
-      </w:r>
-      <w:proofErr w:type="spellStart"/>
-      <w:r>
-        <w:rPr>
-          <w:lang w:val="es-ES"/>
-        </w:rPr>
-        <w:t>frameworks</w:t>
-      </w:r>
-      <w:proofErr w:type="spellEnd"/>
-      <w:r>
-        <w:rPr>
-          <w:lang w:val="es-ES"/>
-        </w:rPr>
-        <w:t xml:space="preserve"> y herramientas empleadas tanto en el desarrollo del </w:t>
-      </w:r>
-      <w:proofErr w:type="spellStart"/>
-      <w:r>
-        <w:rPr>
-          <w:lang w:val="es-ES"/>
-        </w:rPr>
-        <w:t>backend</w:t>
-      </w:r>
-      <w:proofErr w:type="spellEnd"/>
-      <w:r>
-        <w:rPr>
-          <w:lang w:val="es-ES"/>
-        </w:rPr>
-        <w:t xml:space="preserve"> como del </w:t>
-      </w:r>
-      <w:proofErr w:type="spellStart"/>
-      <w:r>
-        <w:rPr>
-          <w:lang w:val="es-ES"/>
-        </w:rPr>
-        <w:t>frontend</w:t>
-      </w:r>
-      <w:proofErr w:type="spellEnd"/>
-      <w:r>
-        <w:rPr>
-          <w:lang w:val="es-ES"/>
-        </w:rPr>
-        <w:t xml:space="preserve"> de la aplicación. También se detallan los entornos y recursos hardware/softwares requeridos.</w:t>
-      </w:r>
-    </w:p>
-    <w:p>
-      <w:pPr>
-        <w:rPr>
-          <w:lang w:val="es-ES"/>
-        </w:rPr>
-      </w:pPr>
-    </w:p>
-    <w:p>
-      <w:pPr>
+      </w:pPr>
+      <w:r>
         <w:rPr>
           <w:b/>
           <w:bCs/>
           <w:lang w:val="es-ES"/>
         </w:rPr>
-      </w:pPr>
-      <w:r>
+        <w:lastRenderedPageBreak/>
+        <w:t>Capítulo 3. Especificación y análisis</w:t>
+      </w:r>
+    </w:p>
+    <w:p>
+      <w:pPr>
+        <w:spacing w:line="360" w:lineRule="auto"/>
+        <w:rPr>
+          <w:lang w:val="es-ES"/>
+        </w:rPr>
+      </w:pPr>
+      <w:r>
+        <w:rPr>
+          <w:lang w:val="es-ES"/>
+        </w:rPr>
+        <w:t>Se detallan los requisitos funcionales y no funcionales del sistema, los casos de uso principales y el modelado de la base de datos.</w:t>
+      </w:r>
+    </w:p>
+    <w:p>
+      <w:pPr>
+        <w:spacing w:line="360" w:lineRule="auto"/>
+        <w:rPr>
+          <w:lang w:val="es-ES"/>
+        </w:rPr>
+      </w:pPr>
+    </w:p>
+    <w:p>
+      <w:pPr>
+        <w:spacing w:line="360" w:lineRule="auto"/>
         <w:rPr>
           <w:b/>
           <w:bCs/>
           <w:lang w:val="es-ES"/>
         </w:rPr>
-        <w:t>Capítulo 3. Especificación y análisis</w:t>
-      </w:r>
-    </w:p>
-    <w:p>
-      <w:pPr>
-        <w:rPr>
-          <w:lang w:val="es-ES"/>
-        </w:rPr>
-      </w:pPr>
-      <w:r>
-        <w:rPr>
-          <w:lang w:val="es-ES"/>
-        </w:rPr>
-        <w:t xml:space="preserve">Se detallan los requisitos funcionales y no funcionales del sistema, </w:t>
-      </w:r>
-      <w:r>
-        <w:rPr>
-          <w:highlight w:val="yellow"/>
-          <w:lang w:val="es-ES"/>
-        </w:rPr>
-        <w:t>así como los casos de uso principales</w:t>
-      </w:r>
-      <w:r>
-        <w:rPr>
-          <w:lang w:val="es-ES"/>
-        </w:rPr>
-        <w:t xml:space="preserve"> y el modelado de la base de datos.</w:t>
-      </w:r>
-    </w:p>
-    <w:p>
-      <w:pPr>
-        <w:rPr>
-          <w:lang w:val="es-ES"/>
-        </w:rPr>
-      </w:pPr>
-    </w:p>
-    <w:p>
-      <w:pPr>
+      </w:pPr>
+      <w:r>
         <w:rPr>
           <w:b/>
           <w:bCs/>
           <w:lang w:val="es-ES"/>
         </w:rPr>
-      </w:pPr>
-      <w:r>
+        <w:t>Capítulo 4. Diseño del sistema</w:t>
+      </w:r>
+    </w:p>
+    <w:p>
+      <w:pPr>
+        <w:spacing w:line="360" w:lineRule="auto"/>
+        <w:rPr>
+          <w:lang w:val="es-ES"/>
+        </w:rPr>
+      </w:pPr>
+      <w:r>
+        <w:rPr>
+          <w:lang w:val="es-ES"/>
+        </w:rPr>
+        <w:t>Se expone la arquitectura general de la aplicación, el diseño de los componentes principales (</w:t>
+      </w:r>
+      <w:proofErr w:type="spellStart"/>
+      <w:r>
+        <w:rPr>
+          <w:lang w:val="es-ES"/>
+        </w:rPr>
+        <w:t>frontend</w:t>
+      </w:r>
+      <w:proofErr w:type="spellEnd"/>
+      <w:r>
+        <w:rPr>
+          <w:lang w:val="es-ES"/>
+        </w:rPr>
+        <w:t xml:space="preserve">, </w:t>
+      </w:r>
+      <w:proofErr w:type="spellStart"/>
+      <w:r>
+        <w:rPr>
+          <w:lang w:val="es-ES"/>
+        </w:rPr>
+        <w:t>backend</w:t>
+      </w:r>
+      <w:proofErr w:type="spellEnd"/>
+      <w:r>
+        <w:rPr>
+          <w:lang w:val="es-ES"/>
+        </w:rPr>
+        <w:t xml:space="preserve"> y base de datos) y las decisiones adoptadas para garantizar escalabilidad, mantenibilidad y eficiencia.</w:t>
+      </w:r>
+    </w:p>
+    <w:p>
+      <w:pPr>
+        <w:spacing w:line="360" w:lineRule="auto"/>
+        <w:rPr>
+          <w:lang w:val="es-ES"/>
+        </w:rPr>
+      </w:pPr>
+    </w:p>
+    <w:p>
+      <w:pPr>
+        <w:spacing w:line="360" w:lineRule="auto"/>
         <w:rPr>
           <w:b/>
           <w:bCs/>
           <w:lang w:val="es-ES"/>
         </w:rPr>
-        <w:t>Capítulo 4. Diseño del sistema</w:t>
-      </w:r>
-    </w:p>
-    <w:p>
-      <w:pPr>
-        <w:rPr>
-          <w:lang w:val="es-ES"/>
-        </w:rPr>
-      </w:pPr>
-      <w:r>
-        <w:rPr>
-          <w:lang w:val="es-ES"/>
-        </w:rPr>
-        <w:t>Explica la arquitectura general de la aplicación, el diseño de los componentes principales (</w:t>
-      </w:r>
-      <w:proofErr w:type="spellStart"/>
-      <w:r>
-        <w:rPr>
-          <w:lang w:val="es-ES"/>
-        </w:rPr>
-        <w:t>frontend</w:t>
-      </w:r>
-      <w:proofErr w:type="spellEnd"/>
-      <w:r>
-        <w:rPr>
-          <w:lang w:val="es-ES"/>
-        </w:rPr>
-        <w:t xml:space="preserve">, </w:t>
-      </w:r>
-      <w:proofErr w:type="spellStart"/>
-      <w:r>
-        <w:rPr>
-          <w:lang w:val="es-ES"/>
-        </w:rPr>
-        <w:t>backend</w:t>
-      </w:r>
-      <w:proofErr w:type="spellEnd"/>
-      <w:r>
-        <w:rPr>
-          <w:lang w:val="es-ES"/>
-        </w:rPr>
-        <w:t xml:space="preserve"> y base de datos), y las decisiones adoptadas para asegurar escalabilidad, mantenibilidad y eficiencia.</w:t>
-      </w:r>
-    </w:p>
-    <w:p>
-      <w:pPr>
-        <w:rPr>
-          <w:lang w:val="es-ES"/>
-        </w:rPr>
-      </w:pPr>
-    </w:p>
-    <w:p>
-      <w:pPr>
+      </w:pPr>
+      <w:r>
         <w:rPr>
           <w:b/>
           <w:bCs/>
           <w:lang w:val="es-ES"/>
         </w:rPr>
-      </w:pPr>
-      <w:r>
+        <w:t>Capítulo 5. Implementación y pruebas</w:t>
+      </w:r>
+    </w:p>
+    <w:p>
+      <w:pPr>
+        <w:spacing w:line="360" w:lineRule="auto"/>
+        <w:rPr>
+          <w:lang w:val="es-ES"/>
+        </w:rPr>
+      </w:pPr>
+      <w:r>
+        <w:rPr>
+          <w:lang w:val="es-ES"/>
+        </w:rPr>
+        <w:t>Se describe la implementación del sistema, incluyendo fragmentos de código representativos y descripciones funcionales. Además, se explican las pruebas realizadas para validar el comportamiento y la fiabilidad del sistema.</w:t>
+      </w:r>
+    </w:p>
+    <w:p>
+      <w:pPr>
+        <w:spacing w:line="360" w:lineRule="auto"/>
+        <w:rPr>
+          <w:lang w:val="es-ES"/>
+        </w:rPr>
+      </w:pPr>
+    </w:p>
+    <w:p>
+      <w:pPr>
+        <w:spacing w:line="360" w:lineRule="auto"/>
         <w:rPr>
           <w:b/>
           <w:bCs/>
           <w:lang w:val="es-ES"/>
         </w:rPr>
-        <w:t>Capítulo 5. Implementación y pruebas</w:t>
-      </w:r>
-    </w:p>
-    <w:p>
-      <w:pPr>
-        <w:rPr>
-          <w:lang w:val="es-ES"/>
-        </w:rPr>
-      </w:pPr>
-      <w:r>
-        <w:rPr>
-          <w:lang w:val="es-ES"/>
-        </w:rPr>
-        <w:t>Se muestra cómo se ha llevado a cabo la implementación del sistema, incluyendo fragmentos de código representativos y descripciones funcionales. Además, se explican las pruebas realizadas para validar el comportamiento y fiabilidad del sistema.</w:t>
-      </w:r>
-    </w:p>
-    <w:p>
-      <w:pPr>
-        <w:rPr>
-          <w:lang w:val="es-ES"/>
-        </w:rPr>
-      </w:pPr>
-    </w:p>
-    <w:p>
-      <w:pPr>
+      </w:pPr>
+      <w:r>
         <w:rPr>
           <w:b/>
           <w:bCs/>
           <w:lang w:val="es-ES"/>
         </w:rPr>
-      </w:pPr>
-      <w:r>
+        <w:t>Capítulo 6. Conclusiones y trabajos futuros</w:t>
+      </w:r>
+    </w:p>
+    <w:p>
+      <w:pPr>
+        <w:spacing w:line="360" w:lineRule="auto"/>
+        <w:rPr>
+          <w:lang w:val="es-ES"/>
+        </w:rPr>
+      </w:pPr>
+      <w:r>
+        <w:rPr>
+          <w:lang w:val="es-ES"/>
+        </w:rPr>
+        <w:t>Se resumen los logros obtenidos, se analizan las dificultades encontradas durante el desarrollo y se proponen posibles mejoras o ampliaciones para futuros trabajos.</w:t>
+      </w:r>
+    </w:p>
+    <w:p>
+      <w:pPr>
+        <w:spacing w:line="360" w:lineRule="auto"/>
+        <w:rPr>
+          <w:lang w:val="es-ES"/>
+        </w:rPr>
+      </w:pPr>
+    </w:p>
+    <w:p>
+      <w:pPr>
+        <w:spacing w:line="360" w:lineRule="auto"/>
         <w:rPr>
           <w:b/>
           <w:bCs/>
           <w:lang w:val="es-ES"/>
         </w:rPr>
-        <w:t>Capítulo 6. Conclusiones y trabajos futuros</w:t>
-      </w:r>
-    </w:p>
-    <w:p>
-      <w:pPr>
-        <w:rPr>
-          <w:lang w:val="es-ES"/>
-        </w:rPr>
-      </w:pPr>
-      <w:r>
-        <w:rPr>
-          <w:lang w:val="es-ES"/>
-        </w:rPr>
-        <w:t>Resume los logros obtenidos, analiza las dificultades encontradas durante el desarrollo del TFG y propone posibles mejoras o ampliaciones para trabajos futuros.</w:t>
-      </w:r>
-    </w:p>
-    <w:p>
-      <w:pPr>
-        <w:rPr>
-          <w:lang w:val="es-ES"/>
-        </w:rPr>
-      </w:pPr>
-    </w:p>
-    <w:p>
-      <w:pPr>
+      </w:pPr>
+      <w:r>
         <w:rPr>
           <w:b/>
           <w:bCs/>
           <w:lang w:val="es-ES"/>
         </w:rPr>
-      </w:pPr>
-      <w:r>
+        <w:t>Bibliografía</w:t>
+      </w:r>
+    </w:p>
+    <w:p>
+      <w:pPr>
+        <w:spacing w:line="360" w:lineRule="auto"/>
+        <w:rPr>
+          <w:lang w:val="es-ES"/>
+        </w:rPr>
+      </w:pPr>
+      <w:r>
+        <w:rPr>
+          <w:lang w:val="es-ES"/>
+        </w:rPr>
+        <w:t>Se recogen las referencias bibliográficas y web utilizadas para fundamentar y desarrollar el proyecto.</w:t>
+      </w:r>
+    </w:p>
+    <w:p>
+      <w:pPr>
+        <w:spacing w:line="360" w:lineRule="auto"/>
+        <w:rPr>
+          <w:lang w:val="es-ES"/>
+        </w:rPr>
+      </w:pPr>
+    </w:p>
+    <w:p>
+      <w:pPr>
+        <w:spacing w:line="360" w:lineRule="auto"/>
         <w:rPr>
           <w:b/>
           <w:bCs/>
           <w:lang w:val="es-ES"/>
         </w:rPr>
-        <w:t>Bibliografía</w:t>
-      </w:r>
-    </w:p>
-    <w:p>
-      <w:pPr>
-        <w:rPr>
-          <w:lang w:val="es-ES"/>
-        </w:rPr>
-      </w:pPr>
-      <w:r>
-        <w:rPr>
-          <w:lang w:val="es-ES"/>
-        </w:rPr>
-        <w:t>Contiene las referencias bibliográficas y web utilizadas para fundamentar y desarrollar el proyecto.</w:t>
-      </w:r>
-    </w:p>
-    <w:p>
-      <w:pPr>
-        <w:rPr>
-          <w:lang w:val="es-ES"/>
-        </w:rPr>
-      </w:pPr>
-    </w:p>
-    <w:p>
-      <w:pPr>
+      </w:pPr>
+      <w:r>
         <w:rPr>
           <w:b/>
           <w:bCs/>
           <w:lang w:val="es-ES"/>
         </w:rPr>
-      </w:pPr>
-      <w:r>
-        <w:rPr>
-          <w:b/>
-          <w:bCs/>
-          <w:lang w:val="es-ES"/>
-        </w:rPr>
         <w:t>Apéndices</w:t>
       </w:r>
     </w:p>
     <w:p>
       <w:pPr>
+        <w:spacing w:line="360" w:lineRule="auto"/>
         <w:rPr>
           <w:lang w:val="es-ES"/>
         </w:rPr>
+        <w:sectPr>
+          <w:headerReference w:type="default" r:id="rId19"/>
+          <w:footerReference w:type="default" r:id="rId20"/>
+          <w:type w:val="oddPage"/>
+          <w:pgSz w:w="11900" w:h="16840"/>
+          <w:pgMar w:top="1418" w:right="1418" w:bottom="1418" w:left="1985" w:header="720" w:footer="720" w:gutter="0"/>
+          <w:pgNumType w:start="1"/>
+          <w:cols w:space="720"/>
+          <w:noEndnote/>
+          <w:docGrid w:linePitch="326"/>
+        </w:sectPr>
       </w:pPr>
       <w:r>
         <w:rPr>
           <w:lang w:val="es-ES"/>
         </w:rPr>
-        <w:t>Se incluyen dos apéndices con información adicional: un Manual de Usuario con instrucciones para utilizar la aplicación y un Manual de Instalación para desplegar el sistema en un entorno local o remoto.</w:t>
+        <w:t>Se incluyen dos apartados adicionales: un Manual de Usuario, que proporciona instrucciones para utilizar la aplicación, y un Manual de Instalación, que describe el procedimiento para desplegar el sistema en un entorno local o remoto</w:t>
+      </w:r>
+      <w:r>
+        <w:rPr>
+          <w:lang w:val="es-ES"/>
+        </w:rPr>
+        <w:t>.</w:t>
       </w:r>
     </w:p>
     <w:p>
@@ -5677,12 +5733,6 @@
           <w:lang w:val="es-ES"/>
         </w:rPr>
       </w:pPr>
-      <w:r>
-        <w:rPr>
-          <w:lang w:val="es-ES"/>
-        </w:rPr>
-        <w:br w:type="page"/>
-      </w:r>
     </w:p>
     <w:p>
       <w:pPr>
@@ -5695,7 +5745,6 @@
         <w:rPr>
           <w:lang w:val="es-ES"/>
         </w:rPr>
-        <w:lastRenderedPageBreak/>
         <w:t>2</w:t>
       </w:r>
     </w:p>
@@ -5748,21 +5797,30 @@
           <w:ilvl w:val="0"/>
           <w:numId w:val="134"/>
         </w:numPr>
+        <w:spacing w:line="360" w:lineRule="auto"/>
         <w:rPr>
           <w:lang w:val="es-ES"/>
         </w:rPr>
       </w:pPr>
       <w:r>
         <w:rPr>
+          <w:b/>
+          <w:bCs/>
           <w:lang w:val="es-ES"/>
         </w:rPr>
-        <w:t xml:space="preserve">Python: Utilizado para el desarrollo del </w:t>
-      </w:r>
-      <w:proofErr w:type="spellStart"/>
+        <w:t>Python</w:t>
+      </w:r>
       <w:r>
         <w:rPr>
           <w:lang w:val="es-ES"/>
         </w:rPr>
+        <w:t xml:space="preserve">: Utilizado para el desarrollo del </w:t>
+      </w:r>
+      <w:proofErr w:type="spellStart"/>
+      <w:r>
+        <w:rPr>
+          <w:lang w:val="es-ES"/>
+        </w:rPr>
         <w:t>backend</w:t>
       </w:r>
       <w:proofErr w:type="spellEnd"/>
@@ -5772,14 +5830,6 @@
         </w:rPr>
         <w:t xml:space="preserve"> y de los algoritmos de predicción. Python es un lenguaje versátil, muy popular en el ámbito de la ciencia de datos y desarrollo web, gracias a su sencillez y a la gran cantidad de librerías disponibles.</w:t>
       </w:r>
-    </w:p>
-    <w:p>
-      <w:pPr>
-        <w:ind w:left="360"/>
-        <w:rPr>
-          <w:lang w:val="es-ES"/>
-        </w:rPr>
-      </w:pPr>
     </w:p>
     <w:p>
       <w:pPr>
@@ -5788,15 +5838,24 @@
           <w:ilvl w:val="0"/>
           <w:numId w:val="134"/>
         </w:numPr>
+        <w:spacing w:line="360" w:lineRule="auto"/>
         <w:rPr>
           <w:lang w:val="es-ES"/>
         </w:rPr>
       </w:pPr>
       <w:r>
         <w:rPr>
+          <w:b/>
+          <w:bCs/>
           <w:lang w:val="es-ES"/>
         </w:rPr>
-        <w:t xml:space="preserve">JavaScript: Utilizado en el </w:t>
+        <w:t>JavaScript</w:t>
+      </w:r>
+      <w:r>
+        <w:rPr>
+          <w:lang w:val="es-ES"/>
+        </w:rPr>
+        <w:t xml:space="preserve">: Utilizado en el </w:t>
       </w:r>
       <w:proofErr w:type="spellStart"/>
       <w:r>
@@ -5815,6 +5874,7 @@
     </w:p>
     <w:p>
       <w:pPr>
+        <w:spacing w:line="360" w:lineRule="auto"/>
         <w:rPr>
           <w:lang w:val="es-ES"/>
         </w:rPr>
@@ -5855,6 +5915,7 @@
           <w:ilvl w:val="0"/>
           <w:numId w:val="135"/>
         </w:numPr>
+        <w:spacing w:line="360" w:lineRule="auto"/>
         <w:rPr>
           <w:lang w:val="es-ES"/>
         </w:rPr>
@@ -5862,6 +5923,8 @@
       <w:proofErr w:type="spellStart"/>
       <w:r>
         <w:rPr>
+          <w:b/>
+          <w:bCs/>
           <w:lang w:val="es-ES"/>
         </w:rPr>
         <w:t>Flask</w:t>
@@ -5921,13 +5984,6 @@
         </w:rPr>
         <w:t>.</w:t>
       </w:r>
-    </w:p>
-    <w:p>
-      <w:pPr>
-        <w:rPr>
-          <w:lang w:val="es-ES"/>
-        </w:rPr>
-      </w:pPr>
     </w:p>
     <w:p>
       <w:pPr>
@@ -5936,6 +5992,7 @@
           <w:ilvl w:val="0"/>
           <w:numId w:val="135"/>
         </w:numPr>
+        <w:spacing w:line="360" w:lineRule="auto"/>
         <w:rPr>
           <w:lang w:val="es-ES"/>
         </w:rPr>
@@ -5943,6 +6000,8 @@
       <w:proofErr w:type="spellStart"/>
       <w:r>
         <w:rPr>
+          <w:b/>
+          <w:bCs/>
           <w:lang w:val="es-ES"/>
         </w:rPr>
         <w:t>React</w:t>
@@ -5980,11 +6039,25 @@
         <w:rPr>
           <w:lang w:val="es-ES"/>
         </w:rPr>
-        <w:t xml:space="preserve"> facilita la creación de componentes reutilizables y optimiza la actualización de la interfaz en respuesta a cambios en los datos.</w:t>
+        <w:t xml:space="preserve"> facilita la creación de componentes</w:t>
+      </w:r>
+      <w:r>
+        <w:rPr>
+          <w:lang w:val="es-ES"/>
+        </w:rPr>
+        <w:t xml:space="preserve"> </w:t>
+      </w:r>
+      <w:r>
+        <w:rPr>
+          <w:lang w:val="es-ES"/>
+        </w:rPr>
+        <w:lastRenderedPageBreak/>
+        <w:t>reutilizables y optimiza la actualización de la interfaz en respuesta a cambios en los datos.</w:t>
       </w:r>
     </w:p>
     <w:p>
       <w:pPr>
+        <w:spacing w:line="360" w:lineRule="auto"/>
         <w:rPr>
           <w:lang w:val="es-ES"/>
         </w:rPr>
@@ -5997,6 +6070,7 @@
           <w:ilvl w:val="0"/>
           <w:numId w:val="135"/>
         </w:numPr>
+        <w:spacing w:line="360" w:lineRule="auto"/>
         <w:rPr>
           <w:lang w:val="es-ES"/>
         </w:rPr>
@@ -6060,6 +6134,7 @@
     </w:p>
     <w:p>
       <w:pPr>
+        <w:spacing w:line="360" w:lineRule="auto"/>
         <w:rPr>
           <w:lang w:val="es-ES"/>
         </w:rPr>
@@ -6072,6 +6147,7 @@
           <w:ilvl w:val="0"/>
           <w:numId w:val="135"/>
         </w:numPr>
+        <w:spacing w:line="360" w:lineRule="auto"/>
         <w:rPr>
           <w:lang w:val="es-ES"/>
         </w:rPr>
@@ -9470,6 +9546,7 @@
         <w:rPr>
           <w:lang w:val="en-US"/>
         </w:rPr>
+        <w:lastRenderedPageBreak/>
         <w:t>tenetur</w:t>
       </w:r>
       <w:proofErr w:type="spellEnd"/>
@@ -10617,7 +10694,6 @@
         <w:rPr>
           <w:lang w:val="en-US"/>
         </w:rPr>
-        <w:lastRenderedPageBreak/>
         <w:t xml:space="preserve">Quis autem vel </w:t>
       </w:r>
       <w:proofErr w:type="spellStart"/>
@@ -14537,6 +14613,7 @@
         <w:rPr>
           <w:lang w:val="en-US"/>
         </w:rPr>
+        <w:lastRenderedPageBreak/>
         <w:t>architecto</w:t>
       </w:r>
       <w:proofErr w:type="spellEnd"/>
@@ -15671,7 +15748,6 @@
         <w:rPr>
           <w:lang w:val="en-US"/>
         </w:rPr>
-        <w:lastRenderedPageBreak/>
         <w:t>molestias</w:t>
       </w:r>
       <w:proofErr w:type="spellEnd"/>
@@ -19542,6 +19618,7 @@
         <w:rPr>
           <w:lang w:val="en-US"/>
         </w:rPr>
+        <w:lastRenderedPageBreak/>
         <w:t>velit</w:t>
       </w:r>
       <w:proofErr w:type="spellEnd"/>
@@ -20627,14 +20704,7 @@
         <w:rPr>
           <w:lang w:val="en-US"/>
         </w:rPr>
-        <w:t xml:space="preserve"> quo </w:t>
-      </w:r>
-      <w:r>
-        <w:rPr>
-          <w:lang w:val="en-US"/>
-        </w:rPr>
-        <w:lastRenderedPageBreak/>
-        <w:t xml:space="preserve">minus id </w:t>
+        <w:t xml:space="preserve"> quo minus id </w:t>
       </w:r>
       <w:proofErr w:type="spellStart"/>
       <w:r>
@@ -21238,12 +21308,9 @@
           <w:lang w:val="en-US"/>
         </w:rPr>
         <w:sectPr>
-          <w:headerReference w:type="default" r:id="rId16"/>
-          <w:footerReference w:type="default" r:id="rId17"/>
           <w:type w:val="oddPage"/>
           <w:pgSz w:w="11900" w:h="16840"/>
           <w:pgMar w:top="1418" w:right="1418" w:bottom="1418" w:left="1985" w:header="720" w:footer="720" w:gutter="0"/>
-          <w:pgNumType w:start="1"/>
           <w:cols w:space="720"/>
           <w:noEndnote/>
           <w:docGrid w:linePitch="326"/>
@@ -39474,6 +39541,16 @@
       <w:lang w:val="es-ES" w:eastAsia="es-ES"/>
     </w:rPr>
   </w:style>
+  <w:style w:type="character" w:styleId="Mencinsinresolver">
+    <w:name w:val="Unresolved Mention"/>
+    <w:basedOn w:val="Fuentedeprrafopredeter"/>
+    <w:uiPriority w:val="99"/>
+    <w:rsid w:val="00B73314"/>
+    <w:rPr>
+      <w:color w:val="605E5C"/>
+      <w:shd w:val="clear" w:color="auto" w:fill="E1DFDD"/>
+    </w:rPr>
+  </w:style>
 </w:styles>
 </file>
 

</xml_diff>